<commit_message>
Ex13 and Ex14 done
</commit_message>
<xml_diff>
--- a/EX13/Dhanumithra 11 Ex13.docx
+++ b/EX13/Dhanumithra 11 Ex13.docx
@@ -2708,6 +2708,218 @@
     </w:p>
     <w:p>
       <w:pPr>
+        <w:ind w:left="720"/>
+        <w:rPr>
+          <w:rFonts w:ascii="Arial" w:eastAsia="Consolas" w:hAnsi="Arial" w:cs="Arial"/>
+        </w:rPr>
+      </w:pPr>
+    </w:p>
+    <w:p>
+      <w:pPr>
+        <w:ind w:left="720"/>
+        <w:rPr>
+          <w:rFonts w:ascii="Arial" w:eastAsia="Consolas" w:hAnsi="Arial" w:cs="Arial"/>
+        </w:rPr>
+      </w:pPr>
+      <w:proofErr w:type="spellStart"/>
+      <w:r>
+        <w:rPr>
+          <w:rFonts w:ascii="Arial" w:eastAsia="Consolas" w:hAnsi="Arial" w:cs="Arial"/>
+        </w:rPr>
+        <w:t>sample_img</w:t>
+      </w:r>
+      <w:proofErr w:type="spellEnd"/>
+      <w:r>
+        <w:rPr>
+          <w:rFonts w:ascii="Arial" w:eastAsia="Consolas" w:hAnsi="Arial" w:cs="Arial"/>
+        </w:rPr>
+        <w:t xml:space="preserve"> = </w:t>
+      </w:r>
+      <w:proofErr w:type="spellStart"/>
+      <w:r>
+        <w:rPr>
+          <w:rFonts w:ascii="Arial" w:eastAsia="Consolas" w:hAnsi="Arial" w:cs="Arial"/>
+        </w:rPr>
+        <w:t>Image.fromarray</w:t>
+      </w:r>
+      <w:proofErr w:type="spellEnd"/>
+      <w:r>
+        <w:rPr>
+          <w:rFonts w:ascii="Arial" w:eastAsia="Consolas" w:hAnsi="Arial" w:cs="Arial"/>
+        </w:rPr>
+        <w:t>(</w:t>
+      </w:r>
+      <w:proofErr w:type="spellStart"/>
+      <w:r>
+        <w:rPr>
+          <w:rFonts w:ascii="Arial" w:eastAsia="Consolas" w:hAnsi="Arial" w:cs="Arial"/>
+        </w:rPr>
+        <w:t>X_</w:t>
+      </w:r>
+      <w:proofErr w:type="gramStart"/>
+      <w:r>
+        <w:rPr>
+          <w:rFonts w:ascii="Arial" w:eastAsia="Consolas" w:hAnsi="Arial" w:cs="Arial"/>
+        </w:rPr>
+        <w:t>test</w:t>
+      </w:r>
+      <w:proofErr w:type="spellEnd"/>
+      <w:r>
+        <w:rPr>
+          <w:rFonts w:ascii="Arial" w:eastAsia="Consolas" w:hAnsi="Arial" w:cs="Arial"/>
+        </w:rPr>
+        <w:t>[</w:t>
+      </w:r>
+      <w:proofErr w:type="gramEnd"/>
+      <w:r>
+        <w:rPr>
+          <w:rFonts w:ascii="Arial" w:eastAsia="Consolas" w:hAnsi="Arial" w:cs="Arial"/>
+        </w:rPr>
+        <w:t>3])</w:t>
+      </w:r>
+    </w:p>
+    <w:p>
+      <w:pPr>
+        <w:ind w:left="720"/>
+        <w:rPr>
+          <w:rFonts w:ascii="Arial" w:eastAsia="Consolas" w:hAnsi="Arial" w:cs="Arial"/>
+        </w:rPr>
+      </w:pPr>
+      <w:proofErr w:type="spellStart"/>
+      <w:r>
+        <w:rPr>
+          <w:rFonts w:ascii="Arial" w:eastAsia="Consolas" w:hAnsi="Arial" w:cs="Arial"/>
+        </w:rPr>
+        <w:t>sample_</w:t>
+      </w:r>
+      <w:proofErr w:type="gramStart"/>
+      <w:r>
+        <w:rPr>
+          <w:rFonts w:ascii="Arial" w:eastAsia="Consolas" w:hAnsi="Arial" w:cs="Arial"/>
+        </w:rPr>
+        <w:t>img.save</w:t>
+      </w:r>
+      <w:proofErr w:type="spellEnd"/>
+      <w:proofErr w:type="gramEnd"/>
+      <w:r>
+        <w:rPr>
+          <w:rFonts w:ascii="Arial" w:eastAsia="Consolas" w:hAnsi="Arial" w:cs="Arial"/>
+        </w:rPr>
+        <w:t>("new_digit.png")</w:t>
+      </w:r>
+    </w:p>
+    <w:p>
+      <w:pPr>
+        <w:ind w:left="720"/>
+        <w:rPr>
+          <w:rFonts w:ascii="Arial" w:eastAsia="Consolas" w:hAnsi="Arial" w:cs="Arial"/>
+        </w:rPr>
+      </w:pPr>
+      <w:proofErr w:type="spellStart"/>
+      <w:r>
+        <w:rPr>
+          <w:rFonts w:ascii="Arial" w:eastAsia="Consolas" w:hAnsi="Arial" w:cs="Arial"/>
+        </w:rPr>
+        <w:t>predicted_digit</w:t>
+      </w:r>
+      <w:proofErr w:type="spellEnd"/>
+      <w:r>
+        <w:rPr>
+          <w:rFonts w:ascii="Arial" w:eastAsia="Consolas" w:hAnsi="Arial" w:cs="Arial"/>
+        </w:rPr>
+        <w:t xml:space="preserve"> = </w:t>
+      </w:r>
+      <w:proofErr w:type="spellStart"/>
+      <w:r>
+        <w:rPr>
+          <w:rFonts w:ascii="Arial" w:eastAsia="Consolas" w:hAnsi="Arial" w:cs="Arial"/>
+        </w:rPr>
+        <w:t>predict_custom_</w:t>
+      </w:r>
+      <w:proofErr w:type="gramStart"/>
+      <w:r>
+        <w:rPr>
+          <w:rFonts w:ascii="Arial" w:eastAsia="Consolas" w:hAnsi="Arial" w:cs="Arial"/>
+        </w:rPr>
+        <w:t>image</w:t>
+      </w:r>
+      <w:proofErr w:type="spellEnd"/>
+      <w:r>
+        <w:rPr>
+          <w:rFonts w:ascii="Arial" w:eastAsia="Consolas" w:hAnsi="Arial" w:cs="Arial"/>
+        </w:rPr>
+        <w:t>(</w:t>
+      </w:r>
+      <w:proofErr w:type="gramEnd"/>
+      <w:r>
+        <w:rPr>
+          <w:rFonts w:ascii="Arial" w:eastAsia="Consolas" w:hAnsi="Arial" w:cs="Arial"/>
+        </w:rPr>
+        <w:t>"new_digit.png", model)</w:t>
+      </w:r>
+    </w:p>
+    <w:p>
+      <w:pPr>
+        <w:ind w:left="720"/>
+        <w:rPr>
+          <w:rFonts w:ascii="Arial" w:eastAsia="Consolas" w:hAnsi="Arial" w:cs="Arial"/>
+        </w:rPr>
+      </w:pPr>
+      <w:proofErr w:type="gramStart"/>
+      <w:r>
+        <w:rPr>
+          <w:rFonts w:ascii="Arial" w:eastAsia="Consolas" w:hAnsi="Arial" w:cs="Arial"/>
+        </w:rPr>
+        <w:t>print(</w:t>
+      </w:r>
+      <w:proofErr w:type="spellStart"/>
+      <w:proofErr w:type="gramEnd"/>
+      <w:r>
+        <w:rPr>
+          <w:rFonts w:ascii="Arial" w:eastAsia="Consolas" w:hAnsi="Arial" w:cs="Arial"/>
+          <w:i/>
+          <w:iCs/>
+        </w:rPr>
+        <w:t>f</w:t>
+      </w:r>
+      <w:r>
+        <w:rPr>
+          <w:rFonts w:ascii="Arial" w:eastAsia="Consolas" w:hAnsi="Arial" w:cs="Arial"/>
+        </w:rPr>
+        <w:t>"Predicted</w:t>
+      </w:r>
+      <w:proofErr w:type="spellEnd"/>
+      <w:r>
+        <w:rPr>
+          <w:rFonts w:ascii="Arial" w:eastAsia="Consolas" w:hAnsi="Arial" w:cs="Arial"/>
+        </w:rPr>
+        <w:t xml:space="preserve"> Digit: {</w:t>
+      </w:r>
+      <w:proofErr w:type="spellStart"/>
+      <w:r>
+        <w:rPr>
+          <w:rFonts w:ascii="Arial" w:eastAsia="Consolas" w:hAnsi="Arial" w:cs="Arial"/>
+        </w:rPr>
+        <w:t>predicted_digit</w:t>
+      </w:r>
+      <w:proofErr w:type="spellEnd"/>
+      <w:r>
+        <w:rPr>
+          <w:rFonts w:ascii="Arial" w:eastAsia="Consolas" w:hAnsi="Arial" w:cs="Arial"/>
+        </w:rPr>
+        <w:t>}")</w:t>
+      </w:r>
+    </w:p>
+    <w:p>
+      <w:pPr>
+        <w:ind w:left="720"/>
+        <w:rPr>
+          <w:rFonts w:ascii="Arial" w:eastAsia="Consolas" w:hAnsi="Arial" w:cs="Arial"/>
+        </w:rPr>
+      </w:pPr>
+    </w:p>
+    <w:p>
+      <w:pPr>
         <w:spacing w:before="200" w:after="120"/>
       </w:pPr>
       <w:r>
@@ -2726,6 +2938,52 @@
         <w:spacing w:before="160" w:after="80"/>
       </w:pPr>
       <w:r>
+        <w:drawing>
+          <wp:inline distT="0" distB="0" distL="0" distR="0" wp14:anchorId="027F0349" wp14:editId="0D733BAC">
+            <wp:extent cx="4747846" cy="4023849"/>
+            <wp:effectExtent l="0" t="0" r="0" b="0"/>
+            <wp:docPr id="786924307" name="Picture 1"/>
+            <wp:cNvGraphicFramePr>
+              <a:graphicFrameLocks xmlns:a="http://schemas.openxmlformats.org/drawingml/2006/main" noChangeAspect="1"/>
+            </wp:cNvGraphicFramePr>
+            <a:graphic xmlns:a="http://schemas.openxmlformats.org/drawingml/2006/main">
+              <a:graphicData uri="http://schemas.openxmlformats.org/drawingml/2006/picture">
+                <pic:pic xmlns:pic="http://schemas.openxmlformats.org/drawingml/2006/picture">
+                  <pic:nvPicPr>
+                    <pic:cNvPr id="786924307" name=""/>
+                    <pic:cNvPicPr/>
+                  </pic:nvPicPr>
+                  <pic:blipFill>
+                    <a:blip r:embed="rId5"/>
+                    <a:stretch>
+                      <a:fillRect/>
+                    </a:stretch>
+                  </pic:blipFill>
+                  <pic:spPr>
+                    <a:xfrm>
+                      <a:off x="0" y="0"/>
+                      <a:ext cx="4773502" cy="4045593"/>
+                    </a:xfrm>
+                    <a:prstGeom prst="rect">
+                      <a:avLst/>
+                    </a:prstGeom>
+                  </pic:spPr>
+                </pic:pic>
+              </a:graphicData>
+            </a:graphic>
+          </wp:inline>
+        </w:drawing>
+      </w:r>
+    </w:p>
+    <w:p>
+      <w:pPr>
+        <w:spacing w:before="160" w:after="80"/>
+      </w:pPr>
+      <w:r>
+        <w:rPr>
+          <w:noProof/>
+        </w:rPr>
+        <w:lastRenderedPageBreak/>
         <w:drawing>
           <wp:inline distT="0" distB="0" distL="0" distR="0" wp14:anchorId="783297C9" wp14:editId="5A27CE48">
             <wp:extent cx="6858000" cy="4684395"/>
@@ -2742,7 +3000,7 @@
                     <pic:cNvPicPr/>
                   </pic:nvPicPr>
                   <pic:blipFill>
-                    <a:blip r:embed="rId5"/>
+                    <a:blip r:embed="rId6"/>
                     <a:stretch>
                       <a:fillRect/>
                     </a:stretch>
@@ -2768,7 +3026,9 @@
         <w:spacing w:before="160" w:after="80"/>
       </w:pPr>
       <w:r>
-        <w:lastRenderedPageBreak/>
+        <w:rPr>
+          <w:noProof/>
+        </w:rPr>
         <w:drawing>
           <wp:inline distT="0" distB="0" distL="0" distR="0" wp14:anchorId="216BAD56" wp14:editId="3555A7F8">
             <wp:extent cx="6858000" cy="2649855"/>
@@ -2785,7 +3045,7 @@
                     <pic:cNvPicPr/>
                   </pic:nvPicPr>
                   <pic:blipFill>
-                    <a:blip r:embed="rId6"/>
+                    <a:blip r:embed="rId7"/>
                     <a:stretch>
                       <a:fillRect/>
                     </a:stretch>
@@ -2805,6 +3065,69 @@
           </wp:inline>
         </w:drawing>
       </w:r>
+    </w:p>
+    <w:p>
+      <w:pPr>
+        <w:spacing w:before="160" w:after="80"/>
+      </w:pPr>
+      <w:r>
+        <w:rPr>
+          <w:b/>
+          <w:bCs/>
+        </w:rPr>
+        <w:t>Convergence &amp; Accuracy</w:t>
+      </w:r>
+      <w:r>
+        <w:t>: The dense fully connected network achieves ~97–98% accuracy within 10 epochs. The loss steadily decreases across training cycles.</w:t>
+      </w:r>
+    </w:p>
+    <w:p>
+      <w:pPr>
+        <w:spacing w:before="160" w:after="80"/>
+      </w:pPr>
+      <w:r>
+        <w:rPr>
+          <w:b/>
+          <w:bCs/>
+        </w:rPr>
+        <w:t>Overfitting Assessment</w:t>
+      </w:r>
+      <w:r>
+        <w:t>: Comparing the training and validation curves shows that training and validation loss remain close throughout. A slight divergence in later epochs indicates mild overfitting, but no severe generalization gap exists.</w:t>
+      </w:r>
+    </w:p>
+    <w:p>
+      <w:pPr>
+        <w:spacing w:before="160" w:after="80"/>
+      </w:pPr>
+      <w:r>
+        <w:rPr>
+          <w:b/>
+          <w:bCs/>
+        </w:rPr>
+        <w:t>Custom Image Sensitivity</w:t>
+      </w:r>
+      <w:r>
+        <w:t xml:space="preserve">: Predicting custom external images requires identical visual preprocessing (black background, </w:t>
+      </w:r>
+      <w:proofErr w:type="spellStart"/>
+      <w:r>
+        <w:t>centered</w:t>
+      </w:r>
+      <w:proofErr w:type="spellEnd"/>
+      <w:r>
+        <w:t xml:space="preserve"> white digit, and 28x28 resolution) to match the distribution of the original MNIST dataset for reliable outputs.</w:t>
+      </w:r>
+    </w:p>
+    <w:p>
+      <w:pPr>
+        <w:spacing w:before="160" w:after="80"/>
+      </w:pPr>
+    </w:p>
+    <w:p>
+      <w:pPr>
+        <w:spacing w:before="160" w:after="80"/>
+      </w:pPr>
     </w:p>
     <w:sectPr>
       <w:pgSz w:w="12240" w:h="15840"/>

</xml_diff>